<commit_message>
Update report with additional hyperlink and source code reference
</commit_message>
<xml_diff>
--- a/SUNUM.docx
+++ b/SUNUM.docx
@@ -235,6 +235,23 @@
         </w:rPr>
         <w:t>Sunum Tarihi: Haziran 2026</w:t>
       </w:r>
+    </w:p>
+    <w:p>
+      <w:pPr>
+        <w:spacing w:after="20" w:before="60"/>
+        <w:jc w:val="center"/>
+      </w:pPr>
+      <w:hyperlink r:id="rId900" w:history="1">
+        <w:r>
+          <w:rPr>
+            <w:rFonts w:ascii="Calibri" w:hAnsi="Calibri"/>
+            <w:color w:val="0563C1"/>
+            <w:sz w:val="20"/>
+            <w:u w:val="single"/>
+          </w:rPr>
+          <w:t xml:space="preserve">https://github.com/YunusAlim/paralelProgramlama</w:t>
+        </w:r>
+      </w:hyperlink>
     </w:p>
     <w:p>
       <w:r>
@@ -3877,6 +3894,23 @@
     </w:p>
     <w:p>
       <w:pPr>
+        <w:spacing w:after="40" w:before="60"/>
+        <w:jc w:val="center"/>
+      </w:pPr>
+      <w:hyperlink r:id="rId901" w:history="1">
+        <w:r>
+          <w:rPr>
+            <w:rFonts w:ascii="Calibri" w:hAnsi="Calibri"/>
+            <w:color w:val="0563C1"/>
+            <w:sz w:val="22"/>
+            <w:u w:val="single"/>
+          </w:rPr>
+          <w:t xml:space="preserve">https://github.com/YunusAlim/paralelProgramlama</w:t>
+        </w:r>
+      </w:hyperlink>
+    </w:p>
+    <w:p>
+      <w:pPr>
         <w:spacing w:after="40" w:before="0"/>
         <w:jc w:val="center"/>
       </w:pPr>

</xml_diff>